<commit_message>
Ajoute 3 references (Moreno-Torres, Domingos & Hulten, Aalen & Johansen), met a jour la table de suivi (16 refs) et remplace la synthese par une version IEEE avec equations LaTeX
</commit_message>
<xml_diff>
--- a/02_biblio/Bibliographie_Sujet39.docx
+++ b/02_biblio/Bibliographie_Sujet39.docx
@@ -48,7 +48,7 @@
           <w:sz w:val="19"/>
           <w:szCs w:val="19"/>
         </w:rPr>
-        <w:t xml:space="preserve">13 références (10 extraites du sujet officiel, dont 7 cachées derrière des hyperliens du PDF non visibles en texte brut ; 3 supplémentaires trouvées dans le document d'introduction "Le paradoxe du point aveugle"). 11 sont téléchargées et dans ce dossier (3 en libre accès + 8 récupérées via accès institutionnel). Ne restent que deux ouvrages (David &amp; Nagaraja, Kalbfleisch &amp; Prentice) qui demandent un emprunt bibliothèque plutôt qu'un téléchargement.</w:t>
+        <w:t xml:space="preserve">16 références (10 extraites du sujet officiel, 3 trouvées dans le document d'introduction, 3 ajoutées suite au document détaillé de Minato — Moreno-Torres et al., Domingos &amp; Hulten, Aalen &amp; Johansen). 13 sont téléchargées et dans ce dossier. Restent 2 livres (David &amp; Nagaraja, Kalbfleisch &amp; Prentice, emprunt bibliothèque) et 1 article payant sans version libre trouvée (Moreno-Torres et al., via Elsevier) — à récupérer via le proxy de la bibliothèque CentraleSupélec.</w:t>
       </w:r>
     </w:p>
     <w:tbl>
@@ -251,19 +251,19 @@
                 <w:sz w:val="19"/>
                 <w:szCs w:val="19"/>
               </w:rPr>
-              <w:t xml:space="preserve">L'article à corriger — lacunes théoriques (indépendance des arbres) et</w:t>
-            </w:r>
-          </w:p>
-          <w:p>
-            <w:pPr>
-              <w:spacing w:after="60"/>
-            </w:pPr>
-            <w:r>
-              <w:rPr>
-                <w:sz w:val="19"/>
-                <w:szCs w:val="19"/>
-              </w:rPr>
-              <w:t xml:space="preserve">méthodologiques identifiées dans l'énoncé du sujet 39.</w:t>
+              <w:t xml:space="preserve">L'article à corriger — lacunes théoriques (indépendance des</w:t>
+            </w:r>
+          </w:p>
+          <w:p>
+            <w:pPr>
+              <w:spacing w:after="60"/>
+            </w:pPr>
+            <w:r>
+              <w:rPr>
+                <w:sz w:val="19"/>
+                <w:szCs w:val="19"/>
+              </w:rPr>
+              <w:t xml:space="preserve">arbres) et méthodologiques identifiées dans l'énoncé du sujet 39.</w:t>
             </w:r>
           </w:p>
           <w:p>
@@ -1682,12 +1682,460 @@
               <w:t xml:space="preserve">Payant — via BU
 </w:t>
             </w:r>
-            <w:hyperlink w:history="1" r:id="rIdbwwacnzdksk8gouqzhuk4">
+            <w:r>
+              <w:rPr>
+                <w:i/>
+                <w:iCs/>
+                <w:sz w:val="17"/>
+                <w:szCs w:val="17"/>
+              </w:rPr>
+              <w:t xml:space="preserve">LIVRE — emprunt bibliothèque, pas de PDF possible.
+En attendant : Esary-Proschan-Walkup 1967 comble
+le trou (voir #16).</w:t>
+            </w:r>
+          </w:p>
+        </w:tc>
+      </w:tr>
+      <w:tr>
+        <w:tc>
+          <w:tcPr>
+            <w:tcW w:type="dxa" w:w="500"/>
+            <w:tcMar>
+              <w:top w:type="dxa" w:w="100"/>
+              <w:left w:type="dxa" w:w="120"/>
+              <w:bottom w:type="dxa" w:w="100"/>
+              <w:right w:type="dxa" w:w="120"/>
+            </w:tcMar>
+          </w:tcPr>
+          <w:p>
+            <w:r>
+              <w:rPr>
+                <w:b/>
+                <w:bCs/>
+                <w:sz w:val="20"/>
+                <w:szCs w:val="20"/>
+              </w:rPr>
+              <w:t xml:space="preserve">11</w:t>
+            </w:r>
+          </w:p>
+        </w:tc>
+        <w:tc>
+          <w:tcPr>
+            <w:tcW w:type="dxa" w:w="4200"/>
+            <w:tcMar>
+              <w:top w:type="dxa" w:w="100"/>
+              <w:left w:type="dxa" w:w="120"/>
+              <w:bottom w:type="dxa" w:w="100"/>
+              <w:right w:type="dxa" w:w="120"/>
+            </w:tcMar>
+          </w:tcPr>
+          <w:p>
+            <w:pPr>
+              <w:spacing w:after="60"/>
+            </w:pPr>
+            <w:r>
+              <w:rPr>
+                <w:b/>
+                <w:bCs/>
+                <w:sz w:val="19"/>
+                <w:szCs w:val="19"/>
+              </w:rPr>
+              <w:t xml:space="preserve">Hinkley, D.V. (1971)</w:t>
+            </w:r>
+          </w:p>
+          <w:p>
+            <w:pPr>
+              <w:spacing w:after="60"/>
+            </w:pPr>
+            <w:r>
+              <w:rPr>
+                <w:b w:val="false"/>
+                <w:bCs w:val="false"/>
+                <w:sz w:val="19"/>
+                <w:szCs w:val="19"/>
+              </w:rPr>
+              <w:t xml:space="preserve">Inference about the change-point from cumulative</w:t>
+            </w:r>
+          </w:p>
+          <w:p>
+            <w:pPr>
+              <w:spacing w:after="60"/>
+            </w:pPr>
+            <w:r>
+              <w:rPr>
+                <w:b w:val="false"/>
+                <w:bCs w:val="false"/>
+                <w:sz w:val="19"/>
+                <w:szCs w:val="19"/>
+              </w:rPr>
+              <w:t xml:space="preserve">sum tests. Biometrika, 58(3), 509–523.</w:t>
+            </w:r>
+          </w:p>
+        </w:tc>
+        <w:tc>
+          <w:tcPr>
+            <w:tcW w:type="dxa" w:w="3050"/>
+            <w:tcMar>
+              <w:top w:type="dxa" w:w="100"/>
+              <w:left w:type="dxa" w:w="120"/>
+              <w:bottom w:type="dxa" w:w="100"/>
+              <w:right w:type="dxa" w:w="120"/>
+            </w:tcMar>
+          </w:tcPr>
+          <w:p>
+            <w:pPr>
+              <w:spacing w:after="60"/>
+            </w:pPr>
+            <w:r>
+              <w:rPr>
+                <w:sz w:val="19"/>
+                <w:szCs w:val="19"/>
+              </w:rPr>
+              <w:t xml:space="preserve">Complète Page (1954) — c'est la moitié "Hinkley"</w:t>
+            </w:r>
+          </w:p>
+          <w:p>
+            <w:pPr>
+              <w:spacing w:after="60"/>
+            </w:pPr>
+            <w:r>
+              <w:rPr>
+                <w:sz w:val="19"/>
+                <w:szCs w:val="19"/>
+              </w:rPr>
+              <w:t xml:space="preserve">du test Page-Hinkley utilisé comme détecteur externe.</w:t>
+            </w:r>
+          </w:p>
+        </w:tc>
+        <w:tc>
+          <w:tcPr>
+            <w:tcW w:type="dxa" w:w="1600"/>
+            <w:tcMar>
+              <w:top w:type="dxa" w:w="100"/>
+              <w:left w:type="dxa" w:w="120"/>
+              <w:bottom w:type="dxa" w:w="100"/>
+              <w:right w:type="dxa" w:w="120"/>
+            </w:tcMar>
+          </w:tcPr>
+          <w:p>
+            <w:pPr>
+              <w:spacing w:after="60"/>
+            </w:pPr>
+            <w:r>
+              <w:rPr>
+                <w:b/>
+                <w:bCs/>
+                <w:color w:val="1B7A3C"/>
+                <w:sz w:val="19"/>
+                <w:szCs w:val="19"/>
+              </w:rPr>
+              <w:t xml:space="preserve">✓ Téléchargé</w:t>
+            </w:r>
+          </w:p>
+        </w:tc>
+      </w:tr>
+      <w:tr>
+        <w:tc>
+          <w:tcPr>
+            <w:tcW w:type="dxa" w:w="500"/>
+            <w:tcMar>
+              <w:top w:type="dxa" w:w="100"/>
+              <w:left w:type="dxa" w:w="120"/>
+              <w:bottom w:type="dxa" w:w="100"/>
+              <w:right w:type="dxa" w:w="120"/>
+            </w:tcMar>
+          </w:tcPr>
+          <w:p>
+            <w:r>
+              <w:rPr>
+                <w:b/>
+                <w:bCs/>
+                <w:sz w:val="20"/>
+                <w:szCs w:val="20"/>
+              </w:rPr>
+              <w:t xml:space="preserve">12</w:t>
+            </w:r>
+          </w:p>
+        </w:tc>
+        <w:tc>
+          <w:tcPr>
+            <w:tcW w:type="dxa" w:w="4200"/>
+            <w:tcMar>
+              <w:top w:type="dxa" w:w="100"/>
+              <w:left w:type="dxa" w:w="120"/>
+              <w:bottom w:type="dxa" w:w="100"/>
+              <w:right w:type="dxa" w:w="120"/>
+            </w:tcMar>
+          </w:tcPr>
+          <w:p>
+            <w:pPr>
+              <w:spacing w:after="60"/>
+            </w:pPr>
+            <w:r>
+              <w:rPr>
+                <w:b/>
+                <w:bCs/>
+                <w:sz w:val="19"/>
+                <w:szCs w:val="19"/>
+              </w:rPr>
+              <w:t xml:space="preserve">Kalbfleisch, J.D. &amp; Prentice, R.L. (2002)</w:t>
+            </w:r>
+          </w:p>
+          <w:p>
+            <w:pPr>
+              <w:spacing w:after="60"/>
+            </w:pPr>
+            <w:r>
+              <w:rPr>
+                <w:b w:val="false"/>
+                <w:bCs w:val="false"/>
+                <w:sz w:val="19"/>
+                <w:szCs w:val="19"/>
+              </w:rPr>
+              <w:t xml:space="preserve">The Statistical Analysis of Failure Time Data</w:t>
+            </w:r>
+          </w:p>
+          <w:p>
+            <w:pPr>
+              <w:spacing w:after="60"/>
+            </w:pPr>
+            <w:r>
+              <w:rPr>
+                <w:b w:val="false"/>
+                <w:bCs w:val="false"/>
+                <w:sz w:val="19"/>
+                <w:szCs w:val="19"/>
+              </w:rPr>
+              <w:t xml:space="preserve">(2e éd.), chapitre 8. Wiley.</w:t>
+            </w:r>
+          </w:p>
+        </w:tc>
+        <w:tc>
+          <w:tcPr>
+            <w:tcW w:type="dxa" w:w="3050"/>
+            <w:tcMar>
+              <w:top w:type="dxa" w:w="100"/>
+              <w:left w:type="dxa" w:w="120"/>
+              <w:bottom w:type="dxa" w:w="100"/>
+              <w:right w:type="dxa" w:w="120"/>
+            </w:tcMar>
+          </w:tcPr>
+          <w:p>
+            <w:pPr>
+              <w:spacing w:after="60"/>
+            </w:pPr>
+            <w:r>
+              <w:rPr>
+                <w:sz w:val="19"/>
+                <w:szCs w:val="19"/>
+              </w:rPr>
+              <w:t xml:space="preserve">Référence manuel sur les risques concurrents :</w:t>
+            </w:r>
+          </w:p>
+          <w:p>
+            <w:pPr>
+              <w:spacing w:after="60"/>
+            </w:pPr>
+            <w:r>
+              <w:rPr>
+                <w:sz w:val="19"/>
+                <w:szCs w:val="19"/>
+              </w:rPr>
+              <w:t xml:space="preserve">estimateur d'Aalen-Johansen, non-identifiabilité</w:t>
+            </w:r>
+          </w:p>
+          <w:p>
+            <w:pPr>
+              <w:spacing w:after="60"/>
+            </w:pPr>
+            <w:r>
+              <w:rPr>
+                <w:sz w:val="19"/>
+                <w:szCs w:val="19"/>
+              </w:rPr>
+              <w:t xml:space="preserve">de la loi jointe des temps latents (Tsiatis, 1975).</w:t>
+            </w:r>
+          </w:p>
+        </w:tc>
+        <w:tc>
+          <w:tcPr>
+            <w:tcW w:type="dxa" w:w="1600"/>
+            <w:tcMar>
+              <w:top w:type="dxa" w:w="100"/>
+              <w:left w:type="dxa" w:w="120"/>
+              <w:bottom w:type="dxa" w:w="100"/>
+              <w:right w:type="dxa" w:w="120"/>
+            </w:tcMar>
+          </w:tcPr>
+          <w:p>
+            <w:pPr>
+              <w:spacing w:after="60"/>
+            </w:pPr>
+            <w:r>
+              <w:rPr>
+                <w:b/>
+                <w:bCs/>
+                <w:color w:val="B03A2E"/>
+                <w:sz w:val="19"/>
+                <w:szCs w:val="19"/>
+              </w:rPr>
+              <w:t xml:space="preserve">Payant — via BU
+</w:t>
+            </w:r>
+            <w:r>
+              <w:rPr>
+                <w:i/>
+                <w:iCs/>
+                <w:sz w:val="17"/>
+                <w:szCs w:val="17"/>
+              </w:rPr>
+              <w:t xml:space="preserve">LIVRE — emprunt bibliothèque, pas de PDF possible.</w:t>
+            </w:r>
+          </w:p>
+        </w:tc>
+      </w:tr>
+      <w:tr>
+        <w:tc>
+          <w:tcPr>
+            <w:tcW w:type="dxa" w:w="500"/>
+            <w:tcMar>
+              <w:top w:type="dxa" w:w="100"/>
+              <w:left w:type="dxa" w:w="120"/>
+              <w:bottom w:type="dxa" w:w="100"/>
+              <w:right w:type="dxa" w:w="120"/>
+            </w:tcMar>
+          </w:tcPr>
+          <w:p>
+            <w:r>
+              <w:rPr>
+                <w:b/>
+                <w:bCs/>
+                <w:sz w:val="20"/>
+                <w:szCs w:val="20"/>
+              </w:rPr>
+              <w:t xml:space="preserve">13</w:t>
+            </w:r>
+          </w:p>
+        </w:tc>
+        <w:tc>
+          <w:tcPr>
+            <w:tcW w:type="dxa" w:w="4200"/>
+            <w:tcMar>
+              <w:top w:type="dxa" w:w="100"/>
+              <w:left w:type="dxa" w:w="120"/>
+              <w:bottom w:type="dxa" w:w="100"/>
+              <w:right w:type="dxa" w:w="120"/>
+            </w:tcMar>
+          </w:tcPr>
+          <w:p>
+            <w:pPr>
+              <w:spacing w:after="60"/>
+            </w:pPr>
+            <w:r>
+              <w:rPr>
+                <w:b/>
+                <w:bCs/>
+                <w:sz w:val="19"/>
+                <w:szCs w:val="19"/>
+              </w:rPr>
+              <w:t xml:space="preserve">Moreno-Torres, J.G. et al. (2012)</w:t>
+            </w:r>
+          </w:p>
+          <w:p>
+            <w:pPr>
+              <w:spacing w:after="60"/>
+            </w:pPr>
+            <w:r>
+              <w:rPr>
+                <w:b w:val="false"/>
+                <w:bCs w:val="false"/>
+                <w:sz w:val="19"/>
+                <w:szCs w:val="19"/>
+              </w:rPr>
+              <w:t xml:space="preserve">A Unifying View on Dataset Shift in Classification.</w:t>
+            </w:r>
+          </w:p>
+          <w:p>
+            <w:pPr>
+              <w:spacing w:after="60"/>
+            </w:pPr>
+            <w:r>
+              <w:rPr>
+                <w:b w:val="false"/>
+                <w:bCs w:val="false"/>
+                <w:sz w:val="19"/>
+                <w:szCs w:val="19"/>
+              </w:rPr>
+              <w:t xml:space="preserve">Pattern Recognition, 45(1), 521–530.</w:t>
+            </w:r>
+          </w:p>
+        </w:tc>
+        <w:tc>
+          <w:tcPr>
+            <w:tcW w:type="dxa" w:w="3050"/>
+            <w:tcMar>
+              <w:top w:type="dxa" w:w="100"/>
+              <w:left w:type="dxa" w:w="120"/>
+              <w:bottom w:type="dxa" w:w="100"/>
+              <w:right w:type="dxa" w:w="120"/>
+            </w:tcMar>
+          </w:tcPr>
+          <w:p>
+            <w:pPr>
+              <w:spacing w:after="60"/>
+            </w:pPr>
+            <w:r>
+              <w:rPr>
+                <w:sz w:val="19"/>
+                <w:szCs w:val="19"/>
+              </w:rPr>
+              <w:t xml:space="preserve">Taxonomie data drift / concept drift — cité par Minato</w:t>
+            </w:r>
+          </w:p>
+          <w:p>
+            <w:pPr>
+              <w:spacing w:after="60"/>
+            </w:pPr>
+            <w:r>
+              <w:rPr>
+                <w:sz w:val="19"/>
+                <w:szCs w:val="19"/>
+              </w:rPr>
+              <w:t xml:space="preserve">en complément de Gama et al. pour cet aspect précis.</w:t>
+            </w:r>
+          </w:p>
+        </w:tc>
+        <w:tc>
+          <w:tcPr>
+            <w:tcW w:type="dxa" w:w="1600"/>
+            <w:tcMar>
+              <w:top w:type="dxa" w:w="100"/>
+              <w:left w:type="dxa" w:w="120"/>
+              <w:bottom w:type="dxa" w:w="100"/>
+              <w:right w:type="dxa" w:w="120"/>
+            </w:tcMar>
+          </w:tcPr>
+          <w:p>
+            <w:pPr>
+              <w:spacing w:after="60"/>
+            </w:pPr>
+            <w:r>
+              <w:rPr>
+                <w:b/>
+                <w:bCs/>
+                <w:color w:val="B03A2E"/>
+                <w:sz w:val="19"/>
+                <w:szCs w:val="19"/>
+              </w:rPr>
+              <w:t xml:space="preserve">Payant — via BU
+</w:t>
+            </w:r>
+            <w:hyperlink w:history="1" r:id="rIdawrhbno7bbj9hjnoodpkg">
               <w:r>
                 <w:rPr>
                   <w:rStyle w:val="Hyperlink"/>
                 </w:rPr>
-                <w:t xml:space="preserve">https://onlinelibrary.wiley.com/doi/book/10.1002/0471722162</w:t>
+                <w:t xml:space="preserve">https://doi.org/10.1016/j.patcog.2011.06.019</w:t>
               </w:r>
             </w:hyperlink>
           </w:p>
@@ -1712,7 +2160,7 @@
                 <w:sz w:val="20"/>
                 <w:szCs w:val="20"/>
               </w:rPr>
-              <w:t xml:space="preserve">11</w:t>
+              <w:t xml:space="preserve">14</w:t>
             </w:r>
           </w:p>
         </w:tc>
@@ -1737,35 +2185,35 @@
                 <w:sz w:val="19"/>
                 <w:szCs w:val="19"/>
               </w:rPr>
-              <w:t xml:space="preserve">Hinkley, D.V. (1971)</w:t>
-            </w:r>
-          </w:p>
-          <w:p>
-            <w:pPr>
-              <w:spacing w:after="60"/>
-            </w:pPr>
-            <w:r>
-              <w:rPr>
-                <w:b w:val="false"/>
-                <w:bCs w:val="false"/>
-                <w:sz w:val="19"/>
-                <w:szCs w:val="19"/>
-              </w:rPr>
-              <w:t xml:space="preserve">Inference about the change-point from cumulative</w:t>
-            </w:r>
-          </w:p>
-          <w:p>
-            <w:pPr>
-              <w:spacing w:after="60"/>
-            </w:pPr>
-            <w:r>
-              <w:rPr>
-                <w:b w:val="false"/>
-                <w:bCs w:val="false"/>
-                <w:sz w:val="19"/>
-                <w:szCs w:val="19"/>
-              </w:rPr>
-              <w:t xml:space="preserve">sum tests. Biometrika, 58(3), 509–523.</w:t>
+              <w:t xml:space="preserve">Domingos, P. &amp; Hulten, G. (2000)</w:t>
+            </w:r>
+          </w:p>
+          <w:p>
+            <w:pPr>
+              <w:spacing w:after="60"/>
+            </w:pPr>
+            <w:r>
+              <w:rPr>
+                <w:b w:val="false"/>
+                <w:bCs w:val="false"/>
+                <w:sz w:val="19"/>
+                <w:szCs w:val="19"/>
+              </w:rPr>
+              <w:t xml:space="preserve">Mining High-Speed Data Streams.</w:t>
+            </w:r>
+          </w:p>
+          <w:p>
+            <w:pPr>
+              <w:spacing w:after="60"/>
+            </w:pPr>
+            <w:r>
+              <w:rPr>
+                <w:b w:val="false"/>
+                <w:bCs w:val="false"/>
+                <w:sz w:val="19"/>
+                <w:szCs w:val="19"/>
+              </w:rPr>
+              <w:t xml:space="preserve">KDD 2000.</w:t>
             </w:r>
           </w:p>
         </w:tc>
@@ -1788,19 +2236,31 @@
                 <w:sz w:val="19"/>
                 <w:szCs w:val="19"/>
               </w:rPr>
-              <w:t xml:space="preserve">Complète Page (1954) — c'est la moitié "Hinkley"</w:t>
-            </w:r>
-          </w:p>
-          <w:p>
-            <w:pPr>
-              <w:spacing w:after="60"/>
-            </w:pPr>
-            <w:r>
-              <w:rPr>
-                <w:sz w:val="19"/>
-                <w:szCs w:val="19"/>
-              </w:rPr>
-              <w:t xml:space="preserve">du test Page-Hinkley utilisé comme détecteur externe.</w:t>
+              <w:t xml:space="preserve">Papier fondateur du Hoeffding Tree — le classifieur en</w:t>
+            </w:r>
+          </w:p>
+          <w:p>
+            <w:pPr>
+              <w:spacing w:after="60"/>
+            </w:pPr>
+            <w:r>
+              <w:rPr>
+                <w:sz w:val="19"/>
+                <w:szCs w:val="19"/>
+              </w:rPr>
+              <w:t xml:space="preserve">ligne sur lequel l'ARF est construite. Minato le cite</w:t>
+            </w:r>
+          </w:p>
+          <w:p>
+            <w:pPr>
+              <w:spacing w:after="60"/>
+            </w:pPr>
+            <w:r>
+              <w:rPr>
+                <w:sz w:val="19"/>
+                <w:szCs w:val="19"/>
+              </w:rPr>
+              <w:t xml:space="preserve">explicitement comme à étudier de près.</w:t>
             </w:r>
           </w:p>
         </w:tc>
@@ -1850,7 +2310,7 @@
                 <w:sz w:val="20"/>
                 <w:szCs w:val="20"/>
               </w:rPr>
-              <w:t xml:space="preserve">12</w:t>
+              <w:t xml:space="preserve">15</w:t>
             </w:r>
           </w:p>
         </w:tc>
@@ -1875,35 +2335,49 @@
                 <w:sz w:val="19"/>
                 <w:szCs w:val="19"/>
               </w:rPr>
-              <w:t xml:space="preserve">Kalbfleisch, J.D. &amp; Prentice, R.L. (2002)</w:t>
-            </w:r>
-          </w:p>
-          <w:p>
-            <w:pPr>
-              <w:spacing w:after="60"/>
-            </w:pPr>
-            <w:r>
-              <w:rPr>
-                <w:b w:val="false"/>
-                <w:bCs w:val="false"/>
-                <w:sz w:val="19"/>
-                <w:szCs w:val="19"/>
-              </w:rPr>
-              <w:t xml:space="preserve">The Statistical Analysis of Failure Time Data</w:t>
-            </w:r>
-          </w:p>
-          <w:p>
-            <w:pPr>
-              <w:spacing w:after="60"/>
-            </w:pPr>
-            <w:r>
-              <w:rPr>
-                <w:b w:val="false"/>
-                <w:bCs w:val="false"/>
-                <w:sz w:val="19"/>
-                <w:szCs w:val="19"/>
-              </w:rPr>
-              <w:t xml:space="preserve">(2e éd.), chapitre 8. Wiley.</w:t>
+              <w:t xml:space="preserve">Aalen, O.O. &amp; Johansen, S. (1978)</w:t>
+            </w:r>
+          </w:p>
+          <w:p>
+            <w:pPr>
+              <w:spacing w:after="60"/>
+            </w:pPr>
+            <w:r>
+              <w:rPr>
+                <w:b w:val="false"/>
+                <w:bCs w:val="false"/>
+                <w:sz w:val="19"/>
+                <w:szCs w:val="19"/>
+              </w:rPr>
+              <w:t xml:space="preserve">An Empirical Transition Matrix for Non-Homogeneous</w:t>
+            </w:r>
+          </w:p>
+          <w:p>
+            <w:pPr>
+              <w:spacing w:after="60"/>
+            </w:pPr>
+            <w:r>
+              <w:rPr>
+                <w:b w:val="false"/>
+                <w:bCs w:val="false"/>
+                <w:sz w:val="19"/>
+                <w:szCs w:val="19"/>
+              </w:rPr>
+              <w:t xml:space="preserve">Markov Chains Based on Censored Observations.</w:t>
+            </w:r>
+          </w:p>
+          <w:p>
+            <w:pPr>
+              <w:spacing w:after="60"/>
+            </w:pPr>
+            <w:r>
+              <w:rPr>
+                <w:b w:val="false"/>
+                <w:bCs w:val="false"/>
+                <w:sz w:val="19"/>
+                <w:szCs w:val="19"/>
+              </w:rPr>
+              <w:t xml:space="preserve">Scand. J. Statistics, 5(3), 141–150.</w:t>
             </w:r>
           </w:p>
         </w:tc>
@@ -1926,31 +2400,31 @@
                 <w:sz w:val="19"/>
                 <w:szCs w:val="19"/>
               </w:rPr>
-              <w:t xml:space="preserve">Référence manuel sur les risques concurrents :</w:t>
-            </w:r>
-          </w:p>
-          <w:p>
-            <w:pPr>
-              <w:spacing w:after="60"/>
-            </w:pPr>
-            <w:r>
-              <w:rPr>
-                <w:sz w:val="19"/>
-                <w:szCs w:val="19"/>
-              </w:rPr>
-              <w:t xml:space="preserve">estimateur d'Aalen-Johansen, non-identifiabilité</w:t>
-            </w:r>
-          </w:p>
-          <w:p>
-            <w:pPr>
-              <w:spacing w:after="60"/>
-            </w:pPr>
-            <w:r>
-              <w:rPr>
-                <w:sz w:val="19"/>
-                <w:szCs w:val="19"/>
-              </w:rPr>
-              <w:t xml:space="preserve">de la loi jointe des temps latents (Tsiatis, 1975).</w:t>
+              <w:t xml:space="preserve">Papier fondateur de l'estimateur d'Aalen-Johansen</w:t>
+            </w:r>
+          </w:p>
+          <w:p>
+            <w:pPr>
+              <w:spacing w:after="60"/>
+            </w:pPr>
+            <w:r>
+              <w:rPr>
+                <w:sz w:val="19"/>
+                <w:szCs w:val="19"/>
+              </w:rPr>
+              <w:t xml:space="preserve">lui-même — celui qu'on utilisera concrètement pour</w:t>
+            </w:r>
+          </w:p>
+          <w:p>
+            <w:pPr>
+              <w:spacing w:after="60"/>
+            </w:pPr>
+            <w:r>
+              <w:rPr>
+                <w:sz w:val="19"/>
+                <w:szCs w:val="19"/>
+              </w:rPr>
+              <w:t xml:space="preserve">estimer F1(t) (Question A).</w:t>
             </w:r>
           </w:p>
         </w:tc>
@@ -1972,21 +2446,12 @@
               <w:rPr>
                 <w:b/>
                 <w:bCs/>
-                <w:color w:val="B03A2E"/>
-                <w:sz w:val="19"/>
-                <w:szCs w:val="19"/>
-              </w:rPr>
-              <w:t xml:space="preserve">Payant — via BU
-</w:t>
-            </w:r>
-            <w:hyperlink w:history="1" r:id="rIdwnvz-_pug9h2ykfoepxiv">
-              <w:r>
-                <w:rPr>
-                  <w:rStyle w:val="Hyperlink"/>
-                </w:rPr>
-                <w:t xml:space="preserve">https://onlinelibrary.wiley.com/doi/book/10.1002/9781118032985</w:t>
-              </w:r>
-            </w:hyperlink>
+                <w:color w:val="1B7A3C"/>
+                <w:sz w:val="19"/>
+                <w:szCs w:val="19"/>
+              </w:rPr>
+              <w:t xml:space="preserve">✓ Téléchargé</w:t>
+            </w:r>
           </w:p>
         </w:tc>
       </w:tr>
@@ -2017,7 +2482,7 @@
           <w:sz w:val="19"/>
           <w:szCs w:val="19"/>
         </w:rPr>
-        <w:t xml:space="preserve">Priorité 1 (à lire avant de contacter Raphaël Minato) : [0] l'article source, [1] Fine &amp; Gray (risques concurrents, Question A), [3] Bifet &amp; Gavaldà (ADWIN), [4] Gomes et al. (ARF).</w:t>
+        <w:t xml:space="preserve">Priorité 1 (théorique) : [0] l'article source, [1] Fine &amp; Gray (Question A), [15] Aalen &amp; Johansen (l'estimateur utilisé), [3] Bifet &amp; Gavaldà (ADWIN), [4] Gomes et al. (ARF), [14] Domingos &amp; Hulten (Hoeffding Tree).</w:t>
       </w:r>
     </w:p>
     <w:p>
@@ -2038,7 +2503,7 @@
           <w:sz w:val="19"/>
           <w:szCs w:val="19"/>
         </w:rPr>
-        <w:t xml:space="preserve">Contexte (à survoler) : [2] Page/CUSUM, [5] Gama et al., [6] Lu et al., [7] Raab et al.</w:t>
+        <w:t xml:space="preserve">Contexte (à survoler) : [2] Page/CUSUM, [5] Gama et al., [6] Lu et al., [7] Raab et al., [13] Moreno-Torres et al.</w:t>
       </w:r>
     </w:p>
     <w:sectPr>

</xml_diff>